<commit_message>
feat(bao-thang-3): hoan thien ma de 0103 dat chuan 11/10 (LaTeX + Word)
</commit_message>
<xml_diff>
--- a/pdf2word/San_Pham/de-khao-sat-toan-12-nam-2026-2027-truong-thpt-bao-thang-3-lao-cai_De_0103.docx
+++ b/pdf2word/San_Pham/de-khao-sat-toan-12-nam-2026-2027-truong-thpt-bao-thang-3-lao-cai_De_0103.docx
@@ -24,7 +24,7 @@
       <w:tr>
         <w:tc>
           <w:tcPr>
-            <w:tcW w:type="dxa" w:w="5556"/>
+            <w:tcW w:type="dxa" w:w="4819"/>
             <w:vAlign w:val="center"/>
           </w:tcPr>
           <w:p>
@@ -57,7 +57,7 @@
         </w:tc>
         <w:tc>
           <w:tcPr>
-            <w:tcW w:type="dxa" w:w="4365"/>
+            <w:tcW w:type="dxa" w:w="5102"/>
             <w:gridSpan w:val="2"/>
             <w:vAlign w:val="center"/>
           </w:tcPr>
@@ -82,12 +82,11 @@
               <w:rPr>
                 <w:rFonts w:ascii="Times New Roman" w:hAnsi="Times New Roman"/>
                 <w:b/>
-                <w:color w:val="002060"/>
                 <w:sz w:val="24"/>
                 <w:rFonts w:ascii="Times New Roman" w:hAnsi="Times New Roman" w:cs="Times New Roman"/>
                 <w:rFonts w:ascii="Times New Roman" w:hAnsi="Times New Roman" w:cs="Times New Roman"/>
               </w:rPr>
-              <w:t>Nguồn: THPT Số 3 Bảo Thắng (2026 - 2027)</w:t>
+              <w:t>THPT Số 3 Bảo Thắng (2026 - 2027)</w:t>
               <w:br/>
             </w:r>
             <w:r>
@@ -106,7 +105,7 @@
       <w:tr>
         <w:tc>
           <w:tcPr>
-            <w:tcW w:type="dxa" w:w="5783"/>
+            <w:tcW w:type="dxa" w:w="4819"/>
             <w:vAlign w:val="center"/>
           </w:tcPr>
           <w:p>
@@ -119,13 +118,13 @@
                 <w:sz w:val="24"/>
                 <w:rFonts w:ascii="Times New Roman" w:hAnsi="Times New Roman" w:cs="Times New Roman"/>
               </w:rPr>
-              <w:t>Họ và tên: ............................................................................</w:t>
+              <w:t>Họ và tên: ................................................................</w:t>
             </w:r>
           </w:p>
         </w:tc>
         <w:tc>
           <w:tcPr>
-            <w:tcW w:type="dxa" w:w="2438"/>
+            <w:tcW w:type="dxa" w:w="3118"/>
             <w:vAlign w:val="center"/>
           </w:tcPr>
           <w:p>
@@ -138,13 +137,13 @@
                 <w:sz w:val="24"/>
                 <w:rFonts w:ascii="Times New Roman" w:hAnsi="Times New Roman" w:cs="Times New Roman"/>
               </w:rPr>
-              <w:t>Số báo danh: .......</w:t>
+              <w:t>Số báo danh: ................</w:t>
             </w:r>
           </w:p>
         </w:tc>
         <w:tc>
           <w:tcPr>
-            <w:tcW w:type="dxa" w:w="1701"/>
+            <w:tcW w:type="dxa" w:w="1984"/>
             <w:vAlign w:val="center"/>
           </w:tcPr>
           <w:p>
@@ -561,7 +560,7 @@
               </w:rPr>
               <w:drawing>
                 <wp:inline>
-                  <wp:extent cx="1800000" cy="678032"/>
+                  <wp:extent cx="1728000" cy="1578424"/>
                   <wp:docPr id="1" name="Picture 1"/>
                   <wp:cNvGraphicFramePr>
                     <a:graphicFrameLocks noChangeAspect="1"/>
@@ -582,7 +581,7 @@
                         <pic:spPr>
                           <a:xfrm>
                             <a:off x="0" y="0"/>
-                            <a:ext cx="1800000" cy="678032"/>
+                            <a:ext cx="1728000" cy="1578424"/>
                           </a:xfrm>
                           <a:prstGeom prst="rect"/>
                         </pic:spPr>
@@ -679,7 +678,7 @@
           <w:sz w:val="24"/>
           <w:rFonts w:ascii="Times New Roman" w:hAnsi="Times New Roman" w:cs="Times New Roman"/>
         </w:rPr>
-        <w:t xml:space="preserve">có bảng biến thiên như dưới đây.</w:t>
+        <w:t xml:space="preserve">có bảng biến thiên như dưới đây:</w:t>
       </w:r>
     </w:p>
     <w:p>
@@ -703,7 +702,7 @@
         </w:rPr>
         <w:drawing>
           <wp:inline>
-            <wp:extent cx="3420000" cy="818182"/>
+            <wp:extent cx="3420000" cy="948516"/>
             <wp:docPr id="4" name="Picture 4"/>
             <wp:cNvGraphicFramePr>
               <a:graphicFrameLocks noChangeAspect="1"/>
@@ -724,7 +723,7 @@
                   <pic:spPr>
                     <a:xfrm>
                       <a:off x="0" y="0"/>
-                      <a:ext cx="3420000" cy="818182"/>
+                      <a:ext cx="3420000" cy="948516"/>
                     </a:xfrm>
                     <a:prstGeom prst="rect"/>
                   </pic:spPr>
@@ -3223,7 +3222,7 @@
         </w:rPr>
         <w:drawing>
           <wp:inline>
-            <wp:extent cx="3420000" cy="880612"/>
+            <wp:extent cx="3420000" cy="864933"/>
             <wp:docPr id="5" name="Picture 5"/>
             <wp:cNvGraphicFramePr>
               <a:graphicFrameLocks noChangeAspect="1"/>
@@ -3244,7 +3243,7 @@
                   <pic:spPr>
                     <a:xfrm>
                       <a:off x="0" y="0"/>
-                      <a:ext cx="3420000" cy="880612"/>
+                      <a:ext cx="3420000" cy="864933"/>
                     </a:xfrm>
                     <a:prstGeom prst="rect"/>
                   </pic:spPr>
@@ -4370,7 +4369,7 @@
               <w:t xml:space="preserve"> </w:t>
             </w:r>
             <w:r>
-              <w:t xml:space="preserve">Đạo hàm là</w:t>
+              <w:t xml:space="preserve">Đạo hàm của hàm số là</w:t>
             </w:r>
             <w:r>
               <w:t xml:space="preserve"> </w:t>
@@ -4626,7 +4625,7 @@
               </w:rPr>
               <w:drawing>
                 <wp:inline>
-                  <wp:extent cx="1800000" cy="797469"/>
+                  <wp:extent cx="1800000" cy="1675862"/>
                   <wp:docPr id="2" name="Picture 2"/>
                   <wp:cNvGraphicFramePr>
                     <a:graphicFrameLocks noChangeAspect="1"/>
@@ -4647,7 +4646,7 @@
                         <pic:spPr>
                           <a:xfrm>
                             <a:off x="0" y="0"/>
-                            <a:ext cx="1800000" cy="797469"/>
+                            <a:ext cx="1800000" cy="1675862"/>
                           </a:xfrm>
                           <a:prstGeom prst="rect"/>
                         </pic:spPr>
@@ -5060,7 +5059,7 @@
               </w:rPr>
               <w:drawing>
                 <wp:inline>
-                  <wp:extent cx="1800000" cy="776498"/>
+                  <wp:extent cx="1728000" cy="1710933"/>
                   <wp:docPr id="3" name="Picture 3"/>
                   <wp:cNvGraphicFramePr>
                     <a:graphicFrameLocks noChangeAspect="1"/>
@@ -5081,7 +5080,7 @@
                         <pic:spPr>
                           <a:xfrm>
                             <a:off x="0" y="0"/>
-                            <a:ext cx="1800000" cy="776498"/>
+                            <a:ext cx="1728000" cy="1710933"/>
                           </a:xfrm>
                           <a:prstGeom prst="rect"/>
                         </pic:spPr>
@@ -5600,7 +5599,7 @@
         <w:t xml:space="preserve"> </w:t>
       </w:r>
       <w:r>
-        <w:t xml:space="preserve">Đạo hàm là</w:t>
+        <w:t xml:space="preserve">Đạo hàm của hàm số là</w:t>
       </w:r>
       <w:r>
         <w:t xml:space="preserve"> </w:t>
@@ -5840,7 +5839,7 @@
         </w:rPr>
         <w:drawing>
           <wp:inline>
-            <wp:extent cx="3420000" cy="1274487"/>
+            <wp:extent cx="3420000" cy="948516"/>
             <wp:docPr id="6" name="Picture 6"/>
             <wp:cNvGraphicFramePr>
               <a:graphicFrameLocks noChangeAspect="1"/>
@@ -5861,7 +5860,7 @@
                   <pic:spPr>
                     <a:xfrm>
                       <a:off x="0" y="0"/>
-                      <a:ext cx="3420000" cy="1274487"/>
+                      <a:ext cx="3420000" cy="948516"/>
                     </a:xfrm>
                     <a:prstGeom prst="rect"/>
                   </pic:spPr>
@@ -6003,7 +6002,7 @@
         </w:rPr>
         <w:drawing>
           <wp:inline>
-            <wp:extent cx="3420000" cy="1051024"/>
+            <wp:extent cx="3420000" cy="864933"/>
             <wp:docPr id="7" name="Picture 7"/>
             <wp:cNvGraphicFramePr>
               <a:graphicFrameLocks noChangeAspect="1"/>
@@ -6024,7 +6023,7 @@
                   <pic:spPr>
                     <a:xfrm>
                       <a:off x="0" y="0"/>
-                      <a:ext cx="3420000" cy="1051024"/>
+                      <a:ext cx="3420000" cy="864933"/>
                     </a:xfrm>
                     <a:prstGeom prst="rect"/>
                   </pic:spPr>
@@ -7868,6 +7867,7 @@
       <w:rFonts w:ascii="Times New Roman" w:hAnsi="Times New Roman"/>
       <w:color w:val="000000"/>
       <w:sz w:val="24"/>
+      <w:rFonts w:ascii="Times New Roman" w:hAnsi="Times New Roman" w:cs="Times New Roman"/>
     </w:rPr>
   </w:style>
   <w:style w:styleId="BodyText" w:type="paragraph">

</xml_diff>